<commit_message>
Add glossary spec and update curriculum taxonomy doc
Adds context_docs/glossary/Quantum Computing Glossary.docx (the baseline
vocabulary and implementation spec for the global glossary) and commits
the pending edit to the taxonomy document.

Co-Authored-By: Claude Sonnet 5.5 <noreply@anthropic.com>
</commit_message>
<xml_diff>
--- a/context_docs/taxonomy/Quantum Computing Curriculum.docx
+++ b/context_docs/taxonomy/Quantum Computing Curriculum.docx
@@ -1018,213 +1018,213 @@
         <w:lastRenderedPageBreak/>
         <w:t>Surface Codes</w:t>
       </w:r>
-    </w:p>
-    <w:p>
-      <w:pPr>
-        <w:pStyle w:val="ListParagraph"/>
-        <w:numPr>
-          <w:ilvl w:val="3"/>
-          <w:numId w:val="2"/>
-        </w:numPr>
-      </w:pPr>
-      <w:r>
-        <w:t>Lattice Geometry</w:t>
-      </w:r>
-    </w:p>
-    <w:p>
-      <w:pPr>
-        <w:pStyle w:val="ListParagraph"/>
-        <w:numPr>
-          <w:ilvl w:val="3"/>
-          <w:numId w:val="2"/>
-        </w:numPr>
-      </w:pPr>
-      <w:r>
-        <w:t xml:space="preserve">Data </w:t>
-      </w:r>
-      <w:proofErr w:type="spellStart"/>
-      <w:r>
-        <w:t>Qubits</w:t>
-      </w:r>
-      <w:proofErr w:type="spellEnd"/>
-    </w:p>
-    <w:p>
-      <w:pPr>
-        <w:pStyle w:val="ListParagraph"/>
-        <w:numPr>
-          <w:ilvl w:val="3"/>
-          <w:numId w:val="2"/>
-        </w:numPr>
-      </w:pPr>
-      <w:r>
-        <w:t>Stabilizer/</w:t>
-      </w:r>
-      <w:proofErr w:type="spellStart"/>
-      <w:r>
-        <w:t>Ancilla</w:t>
-      </w:r>
-      <w:proofErr w:type="spellEnd"/>
-      <w:r>
-        <w:t xml:space="preserve"> Measurements</w:t>
-      </w:r>
-    </w:p>
-    <w:p>
-      <w:pPr>
-        <w:pStyle w:val="ListParagraph"/>
-        <w:numPr>
-          <w:ilvl w:val="3"/>
-          <w:numId w:val="2"/>
-        </w:numPr>
-      </w:pPr>
-      <w:r>
-        <w:t>X/Z errors</w:t>
-      </w:r>
-    </w:p>
-    <w:p>
-      <w:pPr>
-        <w:pStyle w:val="ListParagraph"/>
-        <w:numPr>
-          <w:ilvl w:val="3"/>
-          <w:numId w:val="2"/>
-        </w:numPr>
-      </w:pPr>
-      <w:r>
-        <w:t>Syndrome Changes</w:t>
-      </w:r>
-    </w:p>
-    <w:p>
-      <w:pPr>
-        <w:pStyle w:val="ListParagraph"/>
-        <w:numPr>
-          <w:ilvl w:val="3"/>
-          <w:numId w:val="2"/>
-        </w:numPr>
-      </w:pPr>
-      <w:r>
-        <w:t>Code Distance</w:t>
-      </w:r>
-    </w:p>
-    <w:p>
-      <w:pPr>
-        <w:pStyle w:val="ListParagraph"/>
-        <w:numPr>
-          <w:ilvl w:val="2"/>
-          <w:numId w:val="2"/>
-        </w:numPr>
-      </w:pPr>
-      <w:r>
-        <w:t>Minimum-Weight Perfect Matching</w:t>
-      </w:r>
-    </w:p>
-    <w:p>
-      <w:pPr>
-        <w:pStyle w:val="ListParagraph"/>
-        <w:numPr>
-          <w:ilvl w:val="3"/>
-          <w:numId w:val="2"/>
-        </w:numPr>
-      </w:pPr>
-      <w:r>
-        <w:t>Detection Events</w:t>
-      </w:r>
-    </w:p>
-    <w:p>
-      <w:pPr>
-        <w:pStyle w:val="ListParagraph"/>
-        <w:numPr>
-          <w:ilvl w:val="3"/>
-          <w:numId w:val="2"/>
-        </w:numPr>
-      </w:pPr>
-      <w:r>
-        <w:t>Decoding Graph</w:t>
-      </w:r>
-    </w:p>
-    <w:p>
-      <w:pPr>
-        <w:pStyle w:val="ListParagraph"/>
-        <w:numPr>
-          <w:ilvl w:val="3"/>
-          <w:numId w:val="2"/>
-        </w:numPr>
-      </w:pPr>
-      <w:r>
-        <w:t>Edge Weights</w:t>
-      </w:r>
-    </w:p>
-    <w:p>
-      <w:pPr>
-        <w:pStyle w:val="ListParagraph"/>
-        <w:numPr>
-          <w:ilvl w:val="3"/>
-          <w:numId w:val="2"/>
-        </w:numPr>
-      </w:pPr>
-      <w:r>
-        <w:t>Corrections</w:t>
-      </w:r>
-    </w:p>
-    <w:p>
-      <w:pPr>
-        <w:pStyle w:val="ListParagraph"/>
-        <w:numPr>
-          <w:ilvl w:val="2"/>
-          <w:numId w:val="2"/>
-        </w:numPr>
-      </w:pPr>
-      <w:r>
-        <w:t>Lattice Surgery</w:t>
-      </w:r>
-    </w:p>
-    <w:p>
-      <w:pPr>
-        <w:pStyle w:val="ListParagraph"/>
-        <w:numPr>
-          <w:ilvl w:val="3"/>
-          <w:numId w:val="2"/>
-        </w:numPr>
-      </w:pPr>
-      <w:r>
-        <w:t>Logical Patches</w:t>
-      </w:r>
-    </w:p>
-    <w:p>
-      <w:pPr>
-        <w:pStyle w:val="ListParagraph"/>
-        <w:numPr>
-          <w:ilvl w:val="3"/>
-          <w:numId w:val="2"/>
-        </w:numPr>
-      </w:pPr>
-      <w:r>
-        <w:t>Boundaries</w:t>
-      </w:r>
-    </w:p>
-    <w:p>
-      <w:pPr>
-        <w:pStyle w:val="ListParagraph"/>
-        <w:numPr>
-          <w:ilvl w:val="3"/>
-          <w:numId w:val="2"/>
-        </w:numPr>
-      </w:pPr>
-      <w:r>
-        <w:t>Merge/Split</w:t>
-      </w:r>
-    </w:p>
-    <w:p>
-      <w:pPr>
-        <w:pStyle w:val="ListParagraph"/>
-        <w:numPr>
-          <w:ilvl w:val="3"/>
-          <w:numId w:val="2"/>
-        </w:numPr>
-      </w:pPr>
-      <w:r>
-        <w:t>Logical Operations</w:t>
-      </w:r>
       <w:bookmarkStart w:id="0" w:name="_GoBack"/>
       <w:bookmarkEnd w:id="0"/>
+    </w:p>
+    <w:p>
+      <w:pPr>
+        <w:pStyle w:val="ListParagraph"/>
+        <w:numPr>
+          <w:ilvl w:val="3"/>
+          <w:numId w:val="2"/>
+        </w:numPr>
+      </w:pPr>
+      <w:r>
+        <w:t>Lattice Geometry</w:t>
+      </w:r>
+    </w:p>
+    <w:p>
+      <w:pPr>
+        <w:pStyle w:val="ListParagraph"/>
+        <w:numPr>
+          <w:ilvl w:val="3"/>
+          <w:numId w:val="2"/>
+        </w:numPr>
+      </w:pPr>
+      <w:r>
+        <w:t xml:space="preserve">Data </w:t>
+      </w:r>
+      <w:proofErr w:type="spellStart"/>
+      <w:r>
+        <w:t>Qubits</w:t>
+      </w:r>
+      <w:proofErr w:type="spellEnd"/>
+    </w:p>
+    <w:p>
+      <w:pPr>
+        <w:pStyle w:val="ListParagraph"/>
+        <w:numPr>
+          <w:ilvl w:val="3"/>
+          <w:numId w:val="2"/>
+        </w:numPr>
+      </w:pPr>
+      <w:r>
+        <w:t>Stabilizer/</w:t>
+      </w:r>
+      <w:proofErr w:type="spellStart"/>
+      <w:r>
+        <w:t>Ancilla</w:t>
+      </w:r>
+      <w:proofErr w:type="spellEnd"/>
+      <w:r>
+        <w:t xml:space="preserve"> Measurements</w:t>
+      </w:r>
+    </w:p>
+    <w:p>
+      <w:pPr>
+        <w:pStyle w:val="ListParagraph"/>
+        <w:numPr>
+          <w:ilvl w:val="3"/>
+          <w:numId w:val="2"/>
+        </w:numPr>
+      </w:pPr>
+      <w:r>
+        <w:t>X/Z errors</w:t>
+      </w:r>
+    </w:p>
+    <w:p>
+      <w:pPr>
+        <w:pStyle w:val="ListParagraph"/>
+        <w:numPr>
+          <w:ilvl w:val="3"/>
+          <w:numId w:val="2"/>
+        </w:numPr>
+      </w:pPr>
+      <w:r>
+        <w:t>Syndrome Changes</w:t>
+      </w:r>
+    </w:p>
+    <w:p>
+      <w:pPr>
+        <w:pStyle w:val="ListParagraph"/>
+        <w:numPr>
+          <w:ilvl w:val="3"/>
+          <w:numId w:val="2"/>
+        </w:numPr>
+      </w:pPr>
+      <w:r>
+        <w:t>Code Distance</w:t>
+      </w:r>
+    </w:p>
+    <w:p>
+      <w:pPr>
+        <w:pStyle w:val="ListParagraph"/>
+        <w:numPr>
+          <w:ilvl w:val="2"/>
+          <w:numId w:val="2"/>
+        </w:numPr>
+      </w:pPr>
+      <w:r>
+        <w:t>Minimum-Weight Perfect Matching</w:t>
+      </w:r>
+    </w:p>
+    <w:p>
+      <w:pPr>
+        <w:pStyle w:val="ListParagraph"/>
+        <w:numPr>
+          <w:ilvl w:val="3"/>
+          <w:numId w:val="2"/>
+        </w:numPr>
+      </w:pPr>
+      <w:r>
+        <w:t>Detection Events</w:t>
+      </w:r>
+    </w:p>
+    <w:p>
+      <w:pPr>
+        <w:pStyle w:val="ListParagraph"/>
+        <w:numPr>
+          <w:ilvl w:val="3"/>
+          <w:numId w:val="2"/>
+        </w:numPr>
+      </w:pPr>
+      <w:r>
+        <w:t>Decoding Graph</w:t>
+      </w:r>
+    </w:p>
+    <w:p>
+      <w:pPr>
+        <w:pStyle w:val="ListParagraph"/>
+        <w:numPr>
+          <w:ilvl w:val="3"/>
+          <w:numId w:val="2"/>
+        </w:numPr>
+      </w:pPr>
+      <w:r>
+        <w:t>Edge Weights</w:t>
+      </w:r>
+    </w:p>
+    <w:p>
+      <w:pPr>
+        <w:pStyle w:val="ListParagraph"/>
+        <w:numPr>
+          <w:ilvl w:val="3"/>
+          <w:numId w:val="2"/>
+        </w:numPr>
+      </w:pPr>
+      <w:r>
+        <w:t>Corrections</w:t>
+      </w:r>
+    </w:p>
+    <w:p>
+      <w:pPr>
+        <w:pStyle w:val="ListParagraph"/>
+        <w:numPr>
+          <w:ilvl w:val="2"/>
+          <w:numId w:val="2"/>
+        </w:numPr>
+      </w:pPr>
+      <w:r>
+        <w:t>Lattice Surgery</w:t>
+      </w:r>
+    </w:p>
+    <w:p>
+      <w:pPr>
+        <w:pStyle w:val="ListParagraph"/>
+        <w:numPr>
+          <w:ilvl w:val="3"/>
+          <w:numId w:val="2"/>
+        </w:numPr>
+      </w:pPr>
+      <w:r>
+        <w:t>Logical Patches</w:t>
+      </w:r>
+    </w:p>
+    <w:p>
+      <w:pPr>
+        <w:pStyle w:val="ListParagraph"/>
+        <w:numPr>
+          <w:ilvl w:val="3"/>
+          <w:numId w:val="2"/>
+        </w:numPr>
+      </w:pPr>
+      <w:r>
+        <w:t>Boundaries</w:t>
+      </w:r>
+    </w:p>
+    <w:p>
+      <w:pPr>
+        <w:pStyle w:val="ListParagraph"/>
+        <w:numPr>
+          <w:ilvl w:val="3"/>
+          <w:numId w:val="2"/>
+        </w:numPr>
+      </w:pPr>
+      <w:r>
+        <w:t>Merge/Split</w:t>
+      </w:r>
+    </w:p>
+    <w:p>
+      <w:pPr>
+        <w:pStyle w:val="ListParagraph"/>
+        <w:numPr>
+          <w:ilvl w:val="3"/>
+          <w:numId w:val="2"/>
+        </w:numPr>
+      </w:pPr>
+      <w:r>
+        <w:t>Logical Operations</w:t>
+      </w:r>
     </w:p>
     <w:p>
       <w:pPr>

</xml_diff>